<commit_message>
fix(report): List of Publications is not applicable
The section listed a "manuscript in preparation (not yet submitted)". The
IIIT Bhopal guideline asks only for accepted / submitted / published papers
("If Any"), so the entry is replaced with a not-applicable statement.
No other report content changed; TOC page numbers re-checked against the
rendered PDF (44 pages, unchanged). Original report and results untouched.

Co-Authored-By: Claude Opus 5.5 <noreply@anthropic.com>
</commit_message>
<xml_diff>
--- a/BTech_Project_Report_Corrected_2026.docx
+++ b/BTech_Project_Report_Corrected_2026.docx
@@ -15455,21 +15455,6 @@
     </w:p>
     <w:p>
       <w:pPr>
-        <w:spacing w:after="280" w:before="0" w:line="276" w:lineRule="auto"/>
-        <w:jc w:val="both"/>
-      </w:pPr>
-      <w:r>
-        <w:rPr>
-          <w:rFonts w:ascii="Times New Roman" w:hAnsi="Times New Roman"/>
-          <w:b w:val="0"/>
-          <w:i/>
-          <w:sz w:val="24"/>
-        </w:rPr>
-        <w:t>Manuscript in preparation (not yet submitted) based on this project work:</w:t>
-      </w:r>
-    </w:p>
-    <w:p>
-      <w:pPr>
         <w:spacing w:after="480" w:before="0" w:line="276" w:lineRule="auto"/>
         <w:jc w:val="both"/>
       </w:pPr>
@@ -15480,7 +15465,7 @@
           <w:i w:val="0"/>
           <w:sz w:val="24"/>
         </w:rPr>
-        <w:t>1.  D. Savaliya, M. Patel, and Faculty Supervisor, "Federated Multimodal Graph Learning for Privacy-Preserving Clinical Risk Stratification on eICU," manuscript in preparation, 2026.</w:t>
+        <w:t>Not applicable. No paper based on this project work has been submitted, accepted, or published at the time of this report.</w:t>
       </w:r>
       <w:r>
         <w:br w:type="page"/>

</xml_diff>